<commit_message>
CDC en format pdf et word dans la doc
</commit_message>
<xml_diff>
--- a/doc/PAPRO1_2024/CDC Fyord - Application mobile AlexanderGaillard.docx
+++ b/doc/PAPRO1_2024/CDC Fyord - Application mobile AlexanderGaillard.docx
@@ -1248,6 +1248,22 @@
               <w:autoSpaceDN w:val="0"/>
               <w:adjustRightInd w:val="0"/>
               <w:rPr>
+                <w:rFonts w:cstheme="minorHAnsi"/>
+              </w:rPr>
+            </w:pPr>
+            <w:r>
+              <w:rPr>
+                <w:rFonts w:cstheme="minorHAnsi"/>
+              </w:rPr>
+              <w:t>Total par semaine normal : 29 périodes</w:t>
+            </w:r>
+          </w:p>
+          <w:p>
+            <w:pPr>
+              <w:autoSpaceDE w:val="0"/>
+              <w:autoSpaceDN w:val="0"/>
+              <w:adjustRightInd w:val="0"/>
+              <w:rPr>
                 <w:rFonts w:ascii="Segoe UI" w:hAnsi="Segoe UI" w:cs="Segoe UI"/>
                 <w:color w:val="212529"/>
                 <w:shd w:val="clear" w:color="auto" w:fill="FFFFFF"/>
@@ -1321,43 +1337,43 @@
               <w:autoSpaceDN w:val="0"/>
               <w:adjustRightInd w:val="0"/>
               <w:rPr>
-                <w:rFonts w:cstheme="minorHAnsi"/>
-              </w:rPr>
-            </w:pPr>
-            <w:proofErr w:type="spellStart"/>
-            <w:r>
-              <w:rPr>
                 <w:rFonts w:ascii="Segoe UI" w:hAnsi="Segoe UI" w:cs="Segoe UI"/>
                 <w:color w:val="212529"/>
                 <w:shd w:val="clear" w:color="auto" w:fill="FFFFFF"/>
               </w:rPr>
-              <w:t>Feriés</w:t>
-            </w:r>
-            <w:proofErr w:type="spellEnd"/>
+            </w:pPr>
             <w:r>
               <w:rPr>
                 <w:rFonts w:ascii="Segoe UI" w:hAnsi="Segoe UI" w:cs="Segoe UI"/>
                 <w:color w:val="212529"/>
                 <w:shd w:val="clear" w:color="auto" w:fill="FFFFFF"/>
               </w:rPr>
-              <w:t xml:space="preserve"> : lu. 19 février 2024 </w:t>
-            </w:r>
-            <w:proofErr w:type="gramStart"/>
+              <w:t>Jours congé pour concours ETML</w:t>
+            </w:r>
             <w:r>
               <w:rPr>
                 <w:rFonts w:ascii="Segoe UI" w:hAnsi="Segoe UI" w:cs="Segoe UI"/>
                 <w:color w:val="212529"/>
                 <w:shd w:val="clear" w:color="auto" w:fill="FFFFFF"/>
               </w:rPr>
-              <w:t>( -</w:t>
-            </w:r>
-            <w:proofErr w:type="gramEnd"/>
+              <w:t xml:space="preserve"> : lu. 19 février 2024 </w:t>
+            </w:r>
+            <w:proofErr w:type="gramStart"/>
             <w:r>
               <w:rPr>
                 <w:rFonts w:ascii="Segoe UI" w:hAnsi="Segoe UI" w:cs="Segoe UI"/>
                 <w:color w:val="212529"/>
                 <w:shd w:val="clear" w:color="auto" w:fill="FFFFFF"/>
               </w:rPr>
+              <w:t>( -</w:t>
+            </w:r>
+            <w:proofErr w:type="gramEnd"/>
+            <w:r>
+              <w:rPr>
+                <w:rFonts w:ascii="Segoe UI" w:hAnsi="Segoe UI" w:cs="Segoe UI"/>
+                <w:color w:val="212529"/>
+                <w:shd w:val="clear" w:color="auto" w:fill="FFFFFF"/>
+              </w:rPr>
               <w:t xml:space="preserve"> 8 périodes )</w:t>
             </w:r>
           </w:p>
@@ -1372,9 +1388,11 @@
             </w:pPr>
             <w:r>
               <w:rPr>
-                <w:rFonts w:cstheme="minorHAnsi"/>
-              </w:rPr>
-              <w:t>8 + 8 + 4 + 9 = 29</w:t>
+                <w:rFonts w:ascii="Segoe UI" w:hAnsi="Segoe UI" w:cs="Segoe UI"/>
+                <w:color w:val="212529"/>
+                <w:shd w:val="clear" w:color="auto" w:fill="FFFFFF"/>
+              </w:rPr>
+              <w:t>8 semaine de projet – 1 semaine de vacance – 1 jour congé</w:t>
             </w:r>
           </w:p>
           <w:p>
@@ -1390,7 +1408,27 @@
               <w:rPr>
                 <w:rFonts w:cstheme="minorHAnsi"/>
               </w:rPr>
-              <w:t xml:space="preserve">7 * 29 = </w:t>
+              <w:t xml:space="preserve"> 7</w:t>
+            </w:r>
+            <w:bookmarkStart w:id="0" w:name="_GoBack"/>
+            <w:bookmarkEnd w:id="0"/>
+            <w:r>
+              <w:rPr>
+                <w:rFonts w:cstheme="minorHAnsi"/>
+              </w:rPr>
+              <w:t xml:space="preserve"> * 29</w:t>
+            </w:r>
+            <w:r>
+              <w:rPr>
+                <w:rFonts w:cstheme="minorHAnsi"/>
+              </w:rPr>
+              <w:t xml:space="preserve">  - 8</w:t>
+            </w:r>
+            <w:r>
+              <w:rPr>
+                <w:rFonts w:cstheme="minorHAnsi"/>
+              </w:rPr>
+              <w:t xml:space="preserve"> = </w:t>
             </w:r>
             <w:r>
               <w:rPr>
@@ -1434,16 +1472,8 @@
               <w:rPr>
                 <w:rFonts w:cstheme="minorHAnsi"/>
               </w:rPr>
-              <w:t>146</w:t>
-            </w:r>
-            <w:r>
-              <w:rPr>
-                <w:rFonts w:cstheme="minorHAnsi"/>
-              </w:rPr>
-              <w:t xml:space="preserve">H </w:t>
-            </w:r>
-            <w:bookmarkStart w:id="0" w:name="_GoBack"/>
-            <w:bookmarkEnd w:id="0"/>
+              <w:t xml:space="preserve">146H </w:t>
+            </w:r>
             <w:r>
               <w:rPr>
                 <w:rFonts w:cstheme="minorHAnsi"/>
@@ -1504,13 +1534,7 @@
               <w:rPr>
                 <w:rFonts w:cstheme="minorHAnsi"/>
               </w:rPr>
-              <w:t>146</w:t>
-            </w:r>
-            <w:r>
-              <w:rPr>
-                <w:rFonts w:cstheme="minorHAnsi"/>
-              </w:rPr>
-              <w:t xml:space="preserve">H </w:t>
+              <w:t xml:space="preserve">146H </w:t>
             </w:r>
             <w:r>
               <w:rPr>
@@ -1792,6 +1816,7 @@
         <w:spacing w:before="360" w:after="240" w:line="240" w:lineRule="auto"/>
       </w:pPr>
       <w:r>
+        <w:lastRenderedPageBreak/>
         <w:t>P</w:t>
       </w:r>
       <w:r>
@@ -1817,7 +1842,6 @@
           <w:rFonts w:eastAsiaTheme="minorHAnsi" w:cstheme="minorBidi"/>
           <w:lang w:val="fr-CH" w:eastAsia="en-US"/>
         </w:rPr>
-        <w:lastRenderedPageBreak/>
         <w:t xml:space="preserve">Le </w:t>
       </w:r>
       <w:bookmarkStart w:id="1" w:name="OLE_LINK1"/>
@@ -2343,21 +2367,7 @@
         <w:rPr>
           <w:rStyle w:val="normaltextrun"/>
         </w:rPr>
-        <w:t xml:space="preserve"> de leur entourage (staff, agent, </w:t>
-      </w:r>
-      <w:proofErr w:type="gramStart"/>
-      <w:r>
-        <w:rPr>
-          <w:rStyle w:val="normaltextrun"/>
-        </w:rPr>
-        <w:t>musiciens</w:t>
-      </w:r>
-      <w:proofErr w:type="gramEnd"/>
-      <w:r>
-        <w:rPr>
-          <w:rStyle w:val="normaltextrun"/>
-        </w:rPr>
-        <w:t>, …).</w:t>
+        <w:t xml:space="preserve"> de leur entourage (staff, agent, musiciens, …).</w:t>
       </w:r>
       <w:r>
         <w:rPr>
@@ -2508,6 +2518,7 @@
       </w:pPr>
       <w:proofErr w:type="spellStart"/>
       <w:r>
+        <w:lastRenderedPageBreak/>
         <w:t>Fyord</w:t>
       </w:r>
       <w:proofErr w:type="spellEnd"/>
@@ -2528,11 +2539,7 @@
       </w:r>
       <w:proofErr w:type="spellEnd"/>
       <w:r>
-        <w:t xml:space="preserve"> et l’ETML </w:t>
-      </w:r>
-      <w:r>
-        <w:lastRenderedPageBreak/>
-        <w:t xml:space="preserve">pour que certains mandats </w:t>
+        <w:t xml:space="preserve"> et l’ETML pour que certains mandats </w:t>
       </w:r>
       <w:r>
         <w:t xml:space="preserve">puissent </w:t>
@@ -3397,7 +3404,7 @@
                 <w:noProof/>
                 <w:sz w:val="20"/>
               </w:rPr>
-              <w:t>2</w:t>
+              <w:t>4</w:t>
             </w:r>
             <w:r>
               <w:rPr>
@@ -6535,7 +6542,7 @@
 </file>
 
 <file path=customXml/itemProps1.xml><?xml version="1.0" encoding="utf-8"?>
-<ds:datastoreItem xmlns:ds="http://schemas.openxmlformats.org/officeDocument/2006/customXml" ds:itemID="{547DBC58-FA89-49BC-AA95-C518B9999929}">
+<ds:datastoreItem xmlns:ds="http://schemas.openxmlformats.org/officeDocument/2006/customXml" ds:itemID="{28EE1F2B-581B-4EBF-82EF-5F4275867EB1}">
   <ds:schemaRefs>
     <ds:schemaRef ds:uri="http://schemas.openxmlformats.org/officeDocument/2006/bibliography"/>
   </ds:schemaRefs>

</xml_diff>